<commit_message>
feat: add 2J AE deep research returns & manuscript revisions, 4J manuscript updates & Step 10 scoring
</commit_message>
<xml_diff>
--- a/4J_docs_occ/writing/submission/4J_manuscript_submission.docx
+++ b/4J_docs_occ/writing/submission/4J_manuscript_submission.docx
@@ -83,7 +83,7 @@
         <w:t xml:space="preserve"> </w:t>
       </w:r>
       <w:r>
-        <w:t xml:space="preserve">A harmonised three-country HETUS corpus (Spain, Italy, United Kingdom; one wave each; 73,254 diaries, 2,024,068 episodes) is serialised to text and used to fine-tune one open-weight 7 B backbone with a low-rank adapter under leave-one-country-out: train on two countries, generate the third conditioned only on its published marginals, and score against a donor pool from the same two countries raked by iterative proportional fitting onto those same marginals. Generated diaries are then carried forward through constrained decoding into building energy simulation on TABULA archetypes and into activity-triggered appliance and hot-water loads, at archetype scale and on an observed building stock.</w:t>
+        <w:t xml:space="preserve">A three-country corpus from the Harmonised European Time Use Survey (HETUS; Spain, Italy, United Kingdom; one wave each; 73,254 diaries, 2,024,068 episodes) is harmonised onto one alphabet, serialised to text and used to fine-tune one open-weight 7 B backbone with a low-rank adapter under leave-one-country-out: train on two countries, generate the third conditioned only on its published marginals, and score against a donor pool from the same two countries raked by iterative proportional fitting onto those same marginals. Generated diaries are then carried forward through constrained decoding into building energy simulation on TABULA archetypes and into activity-triggered appliance and hot-water loads, at archetype scale and on an observed building stock.</w:t>
       </w:r>
       <w:r>
         <w:t xml:space="preserve"> </w:t>
@@ -99,7 +99,7 @@
         <w:t xml:space="preserve"> </w:t>
       </w:r>
       <w:r>
-        <w:t xml:space="preserve">The pre-registered transfer bar is not met in nine of nine fold-band cells: the raked donor pool reproduces the held-out country’s time budget two to six times better than the fine-tuned model, closest miss 2.70 minutes per day, and five further transfer gates agree. Across the range tested here, from 1.5 to 7.3 billion parameters, with the full-parameter tuning and the second model family each assessed on one fold, more capacity does not close the gap: a 4.7-fold larger backbone moves mean absolute error from 42.05 to 43.14 minutes per day, the wrong way; training all 7,377,965,056 parameters instead of the adapter’s 79,953,920 ends at a higher training loss at every epoch; and a second 7 B model family changes nothing any gate resolves. A fictional-country control separates the shortfall into a steering component and an amplitude component: on the reported model the amplitude arm misses its floor in all three folds, at pooled slopes of 0.40 to 0.53 against a floor of 0.80, so the response to an unseen country’s marginals is real and delivered at roughly half the required strength; the steering arm, also measured on the reported model, passes at R-squared 0.99 in every fold. Downstream, one appliance set and one calibration driven by three countries’ diaries place the stock appliance-electricity peak six hours apart, at 14:00 in Spain, 18:00 in Italy and 20:00 in Britain.</w:t>
+        <w:t xml:space="preserve">The pre-registered transfer bar is not met in nine of nine fold-band cells: the fine-tuned model’s time-budget error is 1.1 to 3.9 times the raked donor pool’s, closest miss 2.70 minutes per day, and five further transfer gates agree. Across the range tested here, from 1.5 to 7.3 billion parameters, with the full-parameter tuning and the second model family each assessed on one fold, more capacity does not close the gap: a 4.7-fold larger backbone moves mean absolute error from 42.05 to 43.14 minutes per day, the wrong way; training all 7,377,965,056 parameters instead of the adapter’s 79,953,920 ends at a higher training loss at every epoch; and a second 7 B model family changes nothing any gate resolves. A fictional-country control separates the shortfall into a steering component and an amplitude component: on the reported model the amplitude arm misses its floor in all three folds, at pooled slopes of 0.40 to 0.53 against a floor of 0.80, so the response to an unseen country’s marginals is real and delivered at roughly half the required strength; the steering arm, also measured on the reported model, passes at R-squared 0.99 in every fold. Downstream, one appliance set and one calibration driven by three countries’ diaries place the stock appliance-electricity peak six hours apart, at 14:00 in Spain, 18:00 in Italy and 20:00 in Britain.</w:t>
       </w:r>
       <w:r>
         <w:t xml:space="preserve"> </w:t>
@@ -155,7 +155,7 @@
         </w:numPr>
       </w:pPr>
       <w:r>
-        <w:t xml:space="preserve">A raked pool of real donor diaries beats a fine-tuned 7 B model in 9 of 9 pre-registered cells.</w:t>
+        <w:t xml:space="preserve">Raked real donor diaries beat a fine-tuned 7 B model in 9 of 9 pre-registered cells.</w:t>
       </w:r>
     </w:p>
     <w:p>
@@ -167,7 +167,7 @@
         </w:numPr>
       </w:pPr>
       <w:r>
-        <w:t xml:space="preserve">Capacity is not the cause: bigger backbone, 92x trainable parameters and a second family all leave the gap unclosed.</w:t>
+        <w:t xml:space="preserve">Bigger backbone, 92x trainable parameters, second model family: the gap stays open.</w:t>
       </w:r>
     </w:p>
     <w:p>
@@ -203,7 +203,7 @@
         </w:numPr>
       </w:pPr>
       <w:r>
-        <w:t xml:space="preserve">The bar was fixed and md5-locked before training and is reported unmoved.</w:t>
+        <w:t xml:space="preserve">The bar was fixed and hash-locked before training and is reported unmoved.</w:t>
       </w:r>
     </w:p>
     <w:bookmarkEnd w:id="42"/>
@@ -440,7 +440,7 @@
         <w:pStyle w:val="FirstParagraph"/>
       </w:pPr>
       <w:r>
-        <w:t xml:space="preserve">Every survey-driven occupancy model carries an unstated precondition: that the country being modelled has a time-use survey, and that the modeller can get at its microdata. For a large part of the world neither holds. Within Europe the Harmonised European Time Use Survey covers a minority of member states in any given round, waves are a decade apart, and microdata access runs through accreditation agreements that a building-simulation group may not be able to obtain. The practical consequence is familiar to anyone who has built a national stock model outside the handful of well-surveyed countries: the occupancy schedule is imported wholesale from a country that does have diaries, or it is left at a code default, and neither choice is examined again.</w:t>
+        <w:t xml:space="preserve">Every survey-driven occupancy model carries an unstated precondition: that the country being modelled has a time-use survey, and that the modeller can get at its microdata. For a large part of the world neither holds. Within Europe the Harmonised European Time Use Survey (HETUS) covers a minority of member states in any given round, waves are a decade apart, and microdata access runs through accreditation agreements that a building-simulation group may not be able to obtain. The practical consequence is familiar to anyone who has built a national stock model outside the handful of well-surveyed countries: the occupancy schedule is imported wholesale from a country that does have diaries, or it is left at a code default, and neither choice is examined again.</w:t>
       </w:r>
     </w:p>
     <w:p>
@@ -474,7 +474,7 @@
         <w:pStyle w:val="BodyText"/>
       </w:pPr>
       <w:r>
-        <w:t xml:space="preserve">Published generative work does not test against that baseline. Language-model approaches to tabular and sequential microdata are evaluated on random within-population splits, or against generative adversarial and variational baselines trained on the same population, which measures how well a model reproduces a distribution it has seen rather than one it has not. We searched for a like-for-like comparison between a fine-tuned or prompted language model and a demographically raked real-donor pool on a population the generator had never seen, across synthetic population synthesis, activity-based travel demand, human mobility generation, cross-lingual distributional transfer and tabular generation under shift, and did not find one (searched 2026-09-13; see §6.4 for what this absence does and does not license). Table 1 positions the present study against the lineage it belongs to.</w:t>
+        <w:t xml:space="preserve">Published generative work does not test against that baseline. Language-model approaches to tabular and sequential microdata are evaluated on random within-population splits, or against generative adversarial and variational baselines trained on the same population, which measures how well a model reproduces a distribution it has seen rather than one it has not. The author searched for a like-for-like comparison between a fine-tuned or prompted language model and a demographically raked real-donor pool on a population the generator had never seen, across synthetic population synthesis, activity-based travel demand, human mobility generation, cross-lingual distributional transfer and tabular generation under shift, and did not find one (searched 2026-09-13; see §6.4 for what this absence does and does not license). Table 1 positions the present study against the lineage it belongs to.</w:t>
       </w:r>
     </w:p>
     <w:p>
@@ -1008,7 +1008,7 @@
               <w:pStyle w:val="Compact"/>
             </w:pPr>
             <w:r>
-              <w:t xml:space="preserve">Author’s prior line (single country)</w:t>
+              <w:t xml:space="preserve">Iseri et al. (2026), single country</w:t>
             </w:r>
           </w:p>
         </w:tc>
@@ -1200,7 +1200,7 @@
         <w:pStyle w:val="BodyText"/>
       </w:pPr>
       <w:r>
-        <w:t xml:space="preserve">Occupancy models built from national time-use surveys form a continuous lineage from the first-order inhomogeneous Markov chains of Richardson et al. (2008) and Widén and Wäckelgård (2010), through the higher-order and semi-Markov variants that followed, to the survey-conditioned statistical models reviewed by Osman and Ouf (2021) and Vosoughkhosravi et al. (2023). The baseline reported in the author’s earlier work sits in this family. A first-order inhomogeneous Markov chain, fitted per fold on the training countries, is retained here as a comparator throughout, and its margin is reported alongside the raked-donor null rather than in place of it.</w:t>
+        <w:t xml:space="preserve">Occupancy models built from national time-use surveys form a continuous lineage from the first-order inhomogeneous Markov chains of Richardson et al. (2008) and Widén and Wäckelgård (2010), through the higher-order and semi-Markov variants that followed, to the survey-conditioned statistical models reviewed by Osman and Ouf (2021) and Vosoughkhosravi et al. (2023). The baseline reported in the author’s earlier work (Iseri et al., 2026) sits in this family. A first-order inhomogeneous Markov chain, fitted per fold on the training countries, is retained here as a comparator throughout, and its margin is reported alongside the raked-donor null rather than in place of it.</w:t>
       </w:r>
     </w:p>
     <w:bookmarkEnd w:id="50"/>
@@ -1218,7 +1218,7 @@
         <w:pStyle w:val="FirstParagraph"/>
       </w:pPr>
       <w:r>
-        <w:t xml:space="preserve">Conditioning a generative model on demographic marginals does not certify the joint distribution those marginals came from. We report a case from our own pipeline: a correction that repaired a marginal left the corresponding joint badly wrong, generating more than fifteen hundred employed thirteen-year-olds from a single donor day, and it was detected only because the joint was inspected directly. Every stage of this study therefore scores quantities that were never in the prompt, including dwell-time distributions, transition matrices and co-presence cross-tabulations conditioned on attribute pairs, and treats marginal agreement as a precondition rather than as evidence.</w:t>
+        <w:t xml:space="preserve">Conditioning a generative model on demographic marginals does not certify the joint distribution those marginals came from. One case from this study’s own pipeline illustrates the point: a correction that repaired a marginal left the corresponding joint badly wrong, generating more than fifteen hundred employed thirteen-year-olds from a single donor day, and it was detected only because the joint was inspected directly. Every stage of this study therefore scores quantities that were never in the prompt, including dwell-time distributions, transition matrices and co-presence cross-tabulations conditioned on attribute pairs, and treats marginal agreement as a precondition rather than as evidence.</w:t>
       </w:r>
     </w:p>
     <w:p>
@@ -1244,7 +1244,7 @@
         <w:pStyle w:val="FirstParagraph"/>
       </w:pPr>
       <w:r>
-        <w:t xml:space="preserve">This study’s primary claim was pre-registered. The evaluation file naming the metrics, the bands, the null and the fold structure was frozen and md5-locked before the first training submission, two gates verify that lock at every closure, and the bar it names is the one reported in §5.1. Bands were not moved after the result was seen, no metric was substituted, and the comparison that does not clear its bar is reported at the strength at which it falls short. The design is falsifiable in one sentence, which was the reason for adopting it: if a fine-tuned language model cannot reproduce a held-out country better than a demographically raked pool of real European donor diaries, the transfer claim does not hold.</w:t>
+        <w:t xml:space="preserve">This study’s primary claim was pre-registered. The evaluation file naming the metrics, the bands, the null and the fold structure was frozen and hash-locked before the first training submission, two gates verify that lock at every closure, and the bar it names is the one reported in §5.1. Bands were not moved after the result was seen, no metric was substituted, and the comparison that does not clear its bar is reported at the strength at which it falls short. The design is falsifiable in one sentence, which was the reason for adopting it: if a fine-tuned language model cannot reproduce a held-out country better than a demographically raked pool of real European donor diaries, the transfer claim does not hold.</w:t>
       </w:r>
     </w:p>
     <w:p>
@@ -1270,7 +1270,7 @@
         <w:pStyle w:val="FirstParagraph"/>
       </w:pPr>
       <w:r>
-        <w:t xml:space="preserve">The first contribution is the result itself, stated without softening. Under leave-one-country-out over Spain, Italy and the United Kingdom, a fine-tuned open-weight language model conditioned on published demographic marginals is beaten by a raked pool of real donor diaries in every age band of every fold, by factors of two to six, and by five further pre-registered transfer gates. The shortfall is uniform rather than marginal, and it is not a capacity limitation: a larger backbone, a ninety-two-fold increase in trainable parameters and a different model family were each measured and each changed nothing in the direction that would rescue it.</w:t>
+        <w:t xml:space="preserve">The first contribution is the result itself, stated without softening. Under leave-one-country-out over Spain, Italy and the United Kingdom, a fine-tuned open-weight language model conditioned on published demographic marginals is beaten by a raked pool of real donor diaries in every age band of every fold, by factors of 1.1 to 3.9, and by five further pre-registered transfer gates. The shortfall is uniform rather than marginal, and it is not a capacity limitation: a larger backbone, a ninety-two-fold increase in trainable parameters and a different model family were each measured and each changed nothing in the direction that would rescue it.</w:t>
       </w:r>
     </w:p>
     <w:p>
@@ -1485,7 +1485,7 @@
         <w:t xml:space="preserve"> </w:t>
       </w:r>
       <w:r>
-        <w:t xml:space="preserve">countries, because in this design any property that differs by country is confounded with the split.</w:t>
+        <w:t xml:space="preserve">countries, because in this design any property that differs by country is confounded with the split. The United Kingdom fold is called Britain throughout, for brevity; the survey covers the whole United Kingdom, while the building typology used in §2.3 covers England only.</w:t>
       </w:r>
     </w:p>
     <w:p>
@@ -1596,16 +1596,22 @@
               </w:rPr>
               <w:t xml:space="preserve">Encuesta de Empleo del Tiempo</w:t>
             </w:r>
-          </w:p>
-        </w:tc>
-        <w:tc>
-          <w:tcPr/>
-          <w:p>
-            <w:pPr>
-              <w:pStyle w:val="Compact"/>
-            </w:pPr>
-            <w:r>
-              <w:t xml:space="preserve">UKTUS, UK Data Service SN 8128</w:t>
+            <w:r>
+              <w:t xml:space="preserve"> </w:t>
+            </w:r>
+            <w:r>
+              <w:t xml:space="preserve">(INE, 2011)</w:t>
+            </w:r>
+          </w:p>
+        </w:tc>
+        <w:tc>
+          <w:tcPr/>
+          <w:p>
+            <w:pPr>
+              <w:pStyle w:val="Compact"/>
+            </w:pPr>
+            <w:r>
+              <w:t xml:space="preserve">UK Time Use Survey (UKTUS), UK Data Service SN 8128 (Sullivan and Gershuny, 2023)</w:t>
             </w:r>
           </w:p>
         </w:tc>
@@ -1628,6 +1634,12 @@
               </w:rPr>
               <w:t xml:space="preserve">Uso del Tempo</w:t>
             </w:r>
+            <w:r>
+              <w:t xml:space="preserve"> </w:t>
+            </w:r>
+            <w:r>
+              <w:t xml:space="preserve">(ISTAT, 2016)</w:t>
+            </w:r>
           </w:p>
         </w:tc>
       </w:tr>
@@ -2253,19 +2265,37 @@
         <w:t xml:space="preserve"> </w:t>
       </w:r>
       <w:r>
-        <w:t xml:space="preserve">only its existence. Whether the HETUS framework itself requires a particular day allocation is not</w:t>
-      </w:r>
-      <w:r>
-        <w:t xml:space="preserve"> </w:t>
-      </w:r>
-      <w:r>
-        <w:t xml:space="preserve">asserted here; the guidelines have not been read directly on that question, and the claim made is only</w:t>
-      </w:r>
-      <w:r>
-        <w:t xml:space="preserve"> </w:t>
-      </w:r>
-      <w:r>
-        <w:t xml:space="preserve">about what these three files do, which is measured.</w:t>
+        <w:t xml:space="preserve">only its existence. Whether the HETUS framework itself specifies a diary-day allocation is answered</w:t>
+      </w:r>
+      <w:r>
+        <w:t xml:space="preserve"> </w:t>
+      </w:r>
+      <w:r>
+        <w:t xml:space="preserve">directly by the guidelines, read in full for this study: both the 2008 and 2018 editions recommend two</w:t>
+      </w:r>
+      <w:r>
+        <w:t xml:space="preserve"> </w:t>
+      </w:r>
+      <w:r>
+        <w:t xml:space="preserve">diary days per respondent, one weekday and one weekend day, while noting that a single diary day is</w:t>
+      </w:r>
+      <w:r>
+        <w:t xml:space="preserve"> </w:t>
+      </w:r>
+      <w:r>
+        <w:t xml:space="preserve">acceptable though it leaves intra-personal variation unmeasured (Eurostat, 2009, §2.2.1; Eurostat, 2019,</w:t>
+      </w:r>
+      <w:r>
+        <w:t xml:space="preserve"> </w:t>
+      </w:r>
+      <w:r>
+        <w:t xml:space="preserve">§2.2.1). Of the three files used here, only the British survey follows the two-day recommendation; Spain</w:t>
+      </w:r>
+      <w:r>
+        <w:t xml:space="preserve"> </w:t>
+      </w:r>
+      <w:r>
+        <w:t xml:space="preserve">and Italy use the one-day option the guidelines describe as acceptable, not the one they recommend.</w:t>
       </w:r>
     </w:p>
     <w:p>
@@ -2445,7 +2475,7 @@
         <w:pStyle w:val="FirstParagraph"/>
       </w:pPr>
       <w:r>
-        <w:t xml:space="preserve">Building parameters come from the published TABULA typology workbook, from which this study constructs</w:t>
+        <w:t xml:space="preserve">Building parameters come from the published TABULA typology workbook (Loga et al., 2012; Loga et al., 2016), from which this study constructs</w:t>
       </w:r>
       <w:r>
         <w:t xml:space="preserve"> </w:t>
@@ -2477,7 +2507,7 @@
         <w:pStyle w:val="BodyText"/>
       </w:pPr>
       <w:r>
-        <w:t xml:space="preserve">Weather is one TMYx file per country over the 2009 to 2023 base period, at Valencia Viveros, Birmingham</w:t>
+        <w:t xml:space="preserve">Weather is one typical meteorological year (TMYx) file per country over the 2009 to 2023 base period, at Valencia Viveros, Birmingham</w:t>
       </w:r>
       <w:r>
         <w:t xml:space="preserve"> </w:t>
@@ -3002,7 +3032,7 @@
         <w:pStyle w:val="FirstParagraph"/>
       </w:pPr>
       <w:r>
-        <w:t xml:space="preserve">The reported model is a low-rank adapter fine-tune of an open-weight 7.30-billion-parameter backbone, at</w:t>
+        <w:t xml:space="preserve">The reported model is a low-rank adapter (LoRA; Hu et al., 2022) fine-tune of an open-weight 7.30-billion-parameter backbone, at</w:t>
       </w:r>
       <w:r>
         <w:t xml:space="preserve"> </w:t>
@@ -3168,13 +3198,7 @@
         <w:t xml:space="preserve"> </w:t>
       </w:r>
       <w:r>
-        <w:t xml:space="preserve">type and economic status is fitted by iterative proportional fitting onto published national marginals,</w:t>
-      </w:r>
-      <w:r>
-        <w:t xml:space="preserve"> </w:t>
-      </w:r>
-      <w:r>
-        <w:t xml:space="preserve">to a worst absolute marginal deviation below 1e-13. The marginal sources are national and are named in</w:t>
+        <w:t xml:space="preserve">type and economic status is fitted by iterative proportional fitting onto published national marginals, following the synthetic-population construction of Beckman et al. (1996), to a worst absolute marginal deviation below 1e-13. The marginal sources are national and are named in</w:t>
       </w:r>
       <w:r>
         <w:t xml:space="preserve"> </w:t>
@@ -3452,79 +3476,7 @@
         <w:pStyle w:val="BodyText"/>
       </w:pPr>
       <w:r>
-        <w:t xml:space="preserve">The objection that this comparison is circular deserves an explicit answer rather than a renamed</w:t>
-      </w:r>
-      <w:r>
-        <w:t xml:space="preserve"> </w:t>
-      </w:r>
-      <w:r>
-        <w:t xml:space="preserve">gate. The null is raked onto the same marginals the model was conditioned on, so the two candidates</w:t>
-      </w:r>
-      <w:r>
-        <w:t xml:space="preserve"> </w:t>
-      </w:r>
-      <w:r>
-        <w:t xml:space="preserve">share a reference. That is deliberate. The comparison is not between a candidate and its own target;</w:t>
-      </w:r>
-      <w:r>
-        <w:t xml:space="preserve"> </w:t>
-      </w:r>
-      <w:r>
-        <w:t xml:space="preserve">it is between two candidates’ distance to a third reference that neither produced, published by</w:t>
-      </w:r>
-      <w:r>
-        <w:t xml:space="preserve"> </w:t>
-      </w:r>
-      <w:r>
-        <w:t xml:space="preserve">national statistical offices before either candidate existed. Giving the null weaker or different</w:t>
-      </w:r>
-      <w:r>
-        <w:t xml:space="preserve"> </w:t>
-      </w:r>
-      <w:r>
-        <w:t xml:space="preserve">marginals would not make the test more demanding, it would convert a null into a handicap, and any</w:t>
-      </w:r>
-      <w:r>
-        <w:t xml:space="preserve"> </w:t>
-      </w:r>
-      <w:r>
-        <w:t xml:space="preserve">margin it produced would measure the handicap. The construction is enforced in code rather than</w:t>
-      </w:r>
-      <w:r>
-        <w:t xml:space="preserve"> </w:t>
-      </w:r>
-      <w:r>
-        <w:t xml:space="preserve">asserted: the comparison refuses to run if the two sides carry different marginal sources or if the</w:t>
-      </w:r>
-      <w:r>
-        <w:t xml:space="preserve"> </w:t>
-      </w:r>
-      <w:r>
-        <w:t xml:space="preserve">held-out country appears in the donor pool, and the margin is a difference rather than a ratio, so a</w:t>
-      </w:r>
-      <w:r>
-        <w:t xml:space="preserve"> </w:t>
-      </w:r>
-      <w:r>
-        <w:t xml:space="preserve">null scored against itself returns exactly zero and does not clear the bar. No quantity anywhere in</w:t>
-      </w:r>
-      <w:r>
-        <w:t xml:space="preserve"> </w:t>
-      </w:r>
-      <w:r>
-        <w:t xml:space="preserve">this study is a ratio of two divergences. Figure 2 sets the design out schematically, with the</w:t>
-      </w:r>
-      <w:r>
-        <w:t xml:space="preserve"> </w:t>
-      </w:r>
-      <w:r>
-        <w:t xml:space="preserve">null’s flat seed and the shared-reference argument that keeps the comparison from being a handicap</w:t>
-      </w:r>
-      <w:r>
-        <w:t xml:space="preserve"> </w:t>
-      </w:r>
-      <w:r>
-        <w:t xml:space="preserve">in either direction.</w:t>
+        <w:t xml:space="preserve">The null is raked onto the same marginals the model was conditioned on, so the two candidates share a reference. That is deliberate, and the objection that it makes the comparison circular is answered in full in §6.3. In brief, the comparison is between two candidates’ distance to a third reference that neither produced; the construction is enforced in code, since the comparison refuses to run if the two sides carry different marginal sources or if the held-out country appears in the donor pool; and the margin is a difference rather than a ratio, so a null scored against itself returns exactly zero and does not clear the bar. Figure 2 sets the design out schematically, with the null’s flat seed and the shared-reference argument that keeps the comparison from being a handicap in either direction.</w:t>
       </w:r>
     </w:p>
     <w:p>
@@ -3716,7 +3668,7 @@
         <w:t xml:space="preserve"> </w:t>
       </w:r>
       <w:r>
-        <w:t xml:space="preserve">the author from published TABULA parameters. The parameter source is the TABULA calculator workbook, and</w:t>
+        <w:t xml:space="preserve">the author from published TABULA parameters. The parameter source is the TABULA calculator workbook (Loga et al., 2012, 2016), and</w:t>
       </w:r>
       <w:r>
         <w:t xml:space="preserve"> </w:t>
@@ -3778,7 +3730,7 @@
         <w:pStyle w:val="BodyText"/>
       </w:pPr>
       <w:r>
-        <w:t xml:space="preserve">Simulation uses EnergyPlus 24.2.0, with the build hash read from each run’s own error file rather than</w:t>
+        <w:t xml:space="preserve">Simulation uses EnergyPlus 24.2.0 (Crawley et al., 2001), with the build hash read from each run’s own error file rather than</w:t>
       </w:r>
       <w:r>
         <w:t xml:space="preserve"> </w:t>
@@ -4521,13 +4473,7 @@
         <w:t xml:space="preserve"> </w:t>
       </w:r>
       <w:r>
-        <w:t xml:space="preserve">than invented: the CREST demand model, Widén’s activity-based electricity and lighting work, the</w:t>
-      </w:r>
-      <w:r>
-        <w:t xml:space="preserve"> </w:t>
-      </w:r>
-      <w:r>
-        <w:t xml:space="preserve">LoadProfileGenerator, and RAMP. Only two of those four publish a usable activity-to-appliance mapping</w:t>
+        <w:t xml:space="preserve">than invented: the CREST demand model (Richardson et al., 2010), the activity-based electricity and lighting model of Widén and Wäckelgård (2010), the LoadProfileGenerator (Pflugradt, 2016), and RAMP (Lombardi et al., 2019). Only two of those four publish a usable activity-to-appliance mapping</w:t>
       </w:r>
       <w:r>
         <w:t xml:space="preserve"> </w:t>
@@ -4697,7 +4643,7 @@
         <w:pStyle w:val="BodyText"/>
       </w:pPr>
       <w:r>
-        <w:t xml:space="preserve">Domestic hot water is generated with the Jordan and Vajen four-event tapping model, with short, medium,</w:t>
+        <w:t xml:space="preserve">Domestic hot water is generated with the Jordan and Vajen (2001) four-event tapping model, with short, medium,</w:t>
       </w:r>
       <w:r>
         <w:t xml:space="preserve"> </w:t>
@@ -4741,13 +4687,13 @@
         <w:t xml:space="preserve"> </w:t>
       </w:r>
       <w:r>
-        <w:t xml:space="preserve">no per-person figure and no 60 degree reference anywhere. The 30 to 50 litres per person per day</w:t>
-      </w:r>
-      <w:r>
-        <w:t xml:space="preserve"> </w:t>
-      </w:r>
-      <w:r>
-        <w:t xml:space="preserve">band that was registered traces instead to a review by Fuentes, Arce and Salom, compressed into a</w:t>
+        <w:t xml:space="preserve">no per-person figure and no 60 °C reference anywhere. The 30 to 50 litres per person per day</w:t>
+      </w:r>
+      <w:r>
+        <w:t xml:space="preserve"> </w:t>
+      </w:r>
+      <w:r>
+        <w:t xml:space="preserve">band that was registered traces instead to a review by Fuentes et al. (2018), compressed into a</w:t>
       </w:r>
       <w:r>
         <w:t xml:space="preserve"> </w:t>
@@ -5073,13 +5019,7 @@
         <w:pStyle w:val="BodyText"/>
       </w:pPr>
       <w:r>
-        <w:t xml:space="preserve">That campaign ran to completion and its gate board was never executed. It is described in this paper as a</w:t>
-      </w:r>
-      <w:r>
-        <w:t xml:space="preserve"> </w:t>
-      </w:r>
-      <w:r>
-        <w:t xml:space="preserve">compute campaign whose board was deliberately not read, and no scored result from it is claimed anywhere.</w:t>
+        <w:t xml:space="preserve">That campaign ran to completion. Its gate board was scored only after the results reported in this paper were fixed, under a separate authorisation, and that scoring found a defect that is still to be engineered out: in a small number of cells, dwellings holding different diaries produced byte-identical internal-gain series. No scored result from that campaign is therefore claimed anywhere in this paper, and it is described here as a compute campaign only.</w:t>
       </w:r>
       <w:r>
         <w:t xml:space="preserve"> </w:t>
@@ -5105,7 +5045,7 @@
         <w:pStyle w:val="BodyText"/>
       </w:pPr>
       <w:r>
-        <w:t xml:space="preserve">Two checks from the earlier campaign remain unmet and are the only open items in the whole pipeline.</w:t>
+        <w:t xml:space="preserve">Two checks from the earlier campaign remain unmet and, with the defect above, are the only open items in the whole pipeline.</w:t>
       </w:r>
       <w:r>
         <w:t xml:space="preserve"> </w:t>
@@ -5269,19 +5209,7 @@
         <w:t xml:space="preserve"> </w:t>
       </w:r>
       <w:r>
-        <w:t xml:space="preserve">access. And a refusal is a first-class outcome: where authorisation to run a campaign is not authorisation</w:t>
-      </w:r>
-      <w:r>
-        <w:t xml:space="preserve"> </w:t>
-      </w:r>
-      <w:r>
-        <w:t xml:space="preserve">to read it as a scored result, the tooling refuses to emit a scored verdict, and §4.4 reports one campaign</w:t>
-      </w:r>
-      <w:r>
-        <w:t xml:space="preserve"> </w:t>
-      </w:r>
-      <w:r>
-        <w:t xml:space="preserve">that sits in exactly that state.</w:t>
+        <w:t xml:space="preserve">access. And a refusal is a first-class outcome: authorisation to run a campaign is not authorisation to read it as a scored result, and the tooling refuses to emit a scored verdict until a second, separate authorisation is recorded; the larger observed-stock campaign of §4.4 sat in that state until its board was scored separately, after this paper’s results were fixed.</w:t>
       </w:r>
     </w:p>
     <w:bookmarkEnd w:id="80"/>
@@ -5968,13 +5896,7 @@
         <w:pStyle w:val="BodyText"/>
       </w:pPr>
       <w:r>
-        <w:t xml:space="preserve">Every margin is negative. The null wins every band of every fold by factors between two and six, and the</w:t>
-      </w:r>
-      <w:r>
-        <w:t xml:space="preserve"> </w:t>
-      </w:r>
-      <w:r>
-        <w:t xml:space="preserve">closest the model comes is 2.70 minutes per day short, in the oldest British band. There is no subset of</w:t>
+        <w:t xml:space="preserve">Every margin is negative. The null wins every band of every fold, by factors of 2.3 to 3.9 in eight of the nine cells and by a factor of 1.15 in the ninth, where the closest the model comes is 2.70 minutes per day short, in the oldest British band. There is no subset of</w:t>
       </w:r>
       <w:r>
         <w:t xml:space="preserve"> </w:t>
@@ -6232,7 +6154,7 @@
               <w:pStyle w:val="Compact"/>
             </w:pPr>
             <w:r>
-              <w:t xml:space="preserve">MAPE at or below 15 per cent</w:t>
+              <w:t xml:space="preserve">mean absolute percentage error (MAPE) at or below 15 per cent</w:t>
             </w:r>
           </w:p>
         </w:tc>
@@ -7645,7 +7567,7 @@
         <w:pStyle w:val="BodyText"/>
       </w:pPr>
       <w:r>
-        <w:t xml:space="preserve">The loss-based membership-inference attack returns an area under the curve of 0.6645 against a</w:t>
+        <w:t xml:space="preserve">The loss-based membership-inference attack (Shokri et al., 2017) returns an area under the curve of 0.6645 against a</w:t>
       </w:r>
       <w:r>
         <w:t xml:space="preserve"> </w:t>
@@ -7971,7 +7893,7 @@
               <w:pStyle w:val="Compact"/>
             </w:pPr>
             <w:r>
-              <w:t xml:space="preserve">503 W</w:t>
+              <w:t xml:space="preserve">518 W</w:t>
             </w:r>
           </w:p>
         </w:tc>
@@ -8006,7 +7928,7 @@
               <w:pStyle w:val="Compact"/>
             </w:pPr>
             <w:r>
-              <w:t xml:space="preserve">404 W</w:t>
+              <w:t xml:space="preserve">395 W</w:t>
             </w:r>
           </w:p>
         </w:tc>
@@ -8041,7 +7963,7 @@
               <w:pStyle w:val="Compact"/>
             </w:pPr>
             <w:r>
-              <w:t xml:space="preserve">416 W</w:t>
+              <w:t xml:space="preserve">422 W</w:t>
             </w:r>
           </w:p>
         </w:tc>
@@ -8223,13 +8145,7 @@
         <w:t xml:space="preserve"> </w:t>
       </w:r>
       <w:r>
-        <w:t xml:space="preserve">Britain and 781 in Italy, against the 27,036 minutes that the reference washing machine’s published cycle</w:t>
-      </w:r>
-      <w:r>
-        <w:t xml:space="preserve"> </w:t>
-      </w:r>
-      <w:r>
-        <w:t xml:space="preserve">count requires, giving modelled-to-published ratios of 0.776, 0.179 and 0.092. Stock load-shape agreement</w:t>
+        <w:t xml:space="preserve">Britain and 781 in Italy, against the 27,036 minutes per year that the reference washing machine’s published cycle count requires. After calibration, modelled washing-machine cycles reach 0.776, 0.179 and 0.092 of the published count. Stock load-shape agreement</w:t>
       </w:r>
       <w:r>
         <w:t xml:space="preserve"> </w:t>
@@ -8295,25 +8211,7 @@
         <w:pStyle w:val="BodyText"/>
       </w:pPr>
       <w:r>
-        <w:t xml:space="preserve">One fact prevents a misreading and is printed alongside. The generated diaries do carry a secondary</w:t>
-      </w:r>
-      <w:r>
-        <w:t xml:space="preserve"> </w:t>
-      </w:r>
-      <w:r>
-        <w:t xml:space="preserve">activity field, on 29.816 per cent of episodes and 26.308 per cent of modelled minutes across 29 codes.</w:t>
-      </w:r>
-      <w:r>
-        <w:t xml:space="preserve"> </w:t>
-      </w:r>
-      <w:r>
-        <w:t xml:space="preserve">The information is present and deliberately unused; the ruling rests on its calibration precondition</w:t>
-      </w:r>
-      <w:r>
-        <w:t xml:space="preserve"> </w:t>
-      </w:r>
-      <w:r>
-        <w:t xml:space="preserve">being unsatisfiable, not on the field being absent.</w:t>
+        <w:t xml:space="preserve">One fact prevents a misreading. The generated diaries do carry a secondary activity field, populated at the rates given in §3.9; the information is present and deliberately unused, because the ruling rests on its calibration precondition being unsatisfiable, not on the field being absent.</w:t>
       </w:r>
     </w:p>
     <w:bookmarkEnd w:id="102"/>
@@ -8349,13 +8247,7 @@
         <w:t xml:space="preserve"> </w:t>
       </w:r>
       <w:r>
-        <w:t xml:space="preserve">source publishes 200 litres per day per dwelling at a 35 kelvin rise, with no per-person figure and</w:t>
-      </w:r>
-      <w:r>
-        <w:t xml:space="preserve"> </w:t>
-      </w:r>
-      <w:r>
-        <w:t xml:space="preserve">no 60 degree reference. The band traces instead to a review paper, compressed into a single</w:t>
+        <w:t xml:space="preserve">source publishes 200 litres per day per dwelling at a 35 kelvin rise, with no per-person figure and no 60 °C reference. The band traces instead to a review paper, compressed into a single</w:t>
       </w:r>
       <w:r>
         <w:t xml:space="preserve"> </w:t>
@@ -8606,7 +8498,7 @@
               <w:jc w:val="right"/>
             </w:pPr>
             <w:r>
-              <w:t xml:space="preserve">4.9837</w:t>
+              <w:t xml:space="preserve">4.9837 %</w:t>
             </w:r>
           </w:p>
         </w:tc>
@@ -8618,7 +8510,7 @@
               <w:jc w:val="right"/>
             </w:pPr>
             <w:r>
-              <w:t xml:space="preserve">2.3797</w:t>
+              <w:t xml:space="preserve">2.3797 %</w:t>
             </w:r>
           </w:p>
         </w:tc>
@@ -8630,7 +8522,7 @@
               <w:jc w:val="right"/>
             </w:pPr>
             <w:r>
-              <w:t xml:space="preserve">1.5959</w:t>
+              <w:t xml:space="preserve">1.5959 %</w:t>
             </w:r>
           </w:p>
         </w:tc>
@@ -8924,7 +8816,7 @@
         <w:t xml:space="preserve"> </w:t>
       </w:r>
       <w:r>
-        <w:t xml:space="preserve">cent in Spain, -29.6 per cent in Britain and -36.7 per cent in Italy, a 166-percentage-point spread whose</w:t>
+        <w:t xml:space="preserve">cent in Spain, -29.6 per cent in Britain and -36.7 per cent in Italy, a 173-percentage-point spread whose</w:t>
       </w:r>
       <w:r>
         <w:t xml:space="preserve"> </w:t>
@@ -8976,7 +8868,7 @@
         <w:t xml:space="preserve"> </w:t>
       </w:r>
       <w:r>
-        <w:t xml:space="preserve">of every fold, by factors between two and six, with the closest miss still 2.70 minutes per day on</w:t>
+        <w:t xml:space="preserve">of every fold, by factors of 1.1 to 3.9, with the closest miss still 2.70 minutes per day on</w:t>
       </w:r>
       <w:r>
         <w:t xml:space="preserve"> </w:t>
@@ -9328,43 +9220,7 @@
         <w:pStyle w:val="BodyText"/>
       </w:pPr>
       <w:r>
-        <w:t xml:space="preserve">Where that sits relative to the older lineage is instructive. A first-order inhomogeneous Markov</w:t>
-      </w:r>
-      <w:r>
-        <w:t xml:space="preserve"> </w:t>
-      </w:r>
-      <w:r>
-        <w:t xml:space="preserve">chain, fitted on the same two training countries and scored on the same held-out one, reproduces the</w:t>
-      </w:r>
-      <w:r>
-        <w:t xml:space="preserve"> </w:t>
-      </w:r>
-      <w:r>
-        <w:t xml:space="preserve">transition rate almost exactly, at 0.264 transitions per day against a tolerance of 1.50, and misses</w:t>
-      </w:r>
-      <w:r>
-        <w:t xml:space="preserve"> </w:t>
-      </w:r>
-      <w:r>
-        <w:t xml:space="preserve">the dwell-time distribution by an order of magnitude, at 119.6 minutes of Wasserstein distance</w:t>
-      </w:r>
-      <w:r>
-        <w:t xml:space="preserve"> </w:t>
-      </w:r>
-      <w:r>
-        <w:t xml:space="preserve">against a 10.0 minute band. Matching a rate while missing the distribution is the characteristic</w:t>
-      </w:r>
-      <w:r>
-        <w:t xml:space="preserve"> </w:t>
-      </w:r>
-      <w:r>
-        <w:t xml:space="preserve">first-order shortfall, and it is the clearest single argument for scoring dwell times at all rather</w:t>
-      </w:r>
-      <w:r>
-        <w:t xml:space="preserve"> </w:t>
-      </w:r>
-      <w:r>
-        <w:t xml:space="preserve">than scoring occupancy shares.</w:t>
+        <w:t xml:space="preserve">Where that sits relative to the older lineage is instructive, and §5.5 gives the numbers: the first-order Markov comparator matches the transition rate almost exactly and misses the dwell-time distribution by an order of magnitude. Matching a rate while missing the distribution is the characteristic first-order shortfall, and it is the clearest single argument for scoring dwell times at all rather than scoring occupancy shares.</w:t>
       </w:r>
     </w:p>
     <w:bookmarkEnd w:id="110"/>
@@ -9530,7 +9386,7 @@
         <w:pStyle w:val="FirstParagraph"/>
       </w:pPr>
       <w:r>
-        <w:t xml:space="preserve">We searched for a published like-for-like comparison between a fine-tuned or prompted language model and</w:t>
+        <w:t xml:space="preserve">The author searched for a published like-for-like comparison between a fine-tuned or prompted language model and</w:t>
       </w:r>
       <w:r>
         <w:t xml:space="preserve"> </w:t>
@@ -9542,7 +9398,7 @@
         <w:t xml:space="preserve"> </w:t>
       </w:r>
       <w:r>
-        <w:t xml:space="preserve">(searched 2026-09-13). We also searched for evidence that any learned hybrid has beaten plain raking of</w:t>
+        <w:t xml:space="preserve">(searched 2026-09-13). The author also searched for evidence that any learned hybrid has beaten plain raking of</w:t>
       </w:r>
       <w:r>
         <w:t xml:space="preserve"> </w:t>
@@ -9556,13 +9412,7 @@
         <w:pStyle w:val="BodyText"/>
       </w:pPr>
       <w:r>
-        <w:t xml:space="preserve">An absence found by a search is not a proof of non-existence, and it is reported here in the first person</w:t>
-      </w:r>
-      <w:r>
-        <w:t xml:space="preserve"> </w:t>
-      </w:r>
-      <w:r>
-        <w:t xml:space="preserve">for that reason. What it licenses is modest and worth stating precisely. It licenses the claim that the</w:t>
+        <w:t xml:space="preserve">An absence found by a search is not a proof of non-existence, and it is reported here as a dated search for that reason. What it licenses is modest and worth stating precisely. It licenses the claim that the</w:t>
       </w:r>
       <w:r>
         <w:t xml:space="preserve"> </w:t>
@@ -9946,7 +9796,7 @@
         <w:t xml:space="preserve"> </w:t>
       </w:r>
       <w:r>
-        <w:t xml:space="preserve">published demographic tables produced the better synthetic population by a factor of two to six, runs in</w:t>
+        <w:t xml:space="preserve">published demographic tables produced the better synthetic population by a factor of 1.1 to 3.9, runs in</w:t>
       </w:r>
       <w:r>
         <w:t xml:space="preserve"> </w:t>
@@ -10180,7 +10030,7 @@
         <w:t xml:space="preserve"> </w:t>
       </w:r>
       <w:r>
-        <w:t xml:space="preserve">temptation runs both ways. We searched for a published floor on the number of source populations below</w:t>
+        <w:t xml:space="preserve">temptation runs both ways. The author searched for a published floor on the number of source populations below</w:t>
       </w:r>
       <w:r>
         <w:t xml:space="preserve"> </w:t>
@@ -10352,7 +10202,7 @@
         <w:t xml:space="preserve"> </w:t>
       </w:r>
       <w:r>
-        <w:t xml:space="preserve">vector. Read honestly, that is a statement about the conditioning design, which is ours, and not about</w:t>
+        <w:t xml:space="preserve">vector. Read honestly, that is a statement about the conditioning design, which is this study’s own, and not about</w:t>
       </w:r>
       <w:r>
         <w:t xml:space="preserve"> </w:t>
@@ -10378,7 +10228,7 @@
         <w:t xml:space="preserve"> </w:t>
       </w:r>
       <w:r>
-        <w:t xml:space="preserve">carry it for both sides of a comparison that one side won by a factor of two to six. A richer</w:t>
+        <w:t xml:space="preserve">carry it for both sides of a comparison that one side won by a factor of 1.1 to 3.9. A richer</w:t>
       </w:r>
       <w:r>
         <w:t xml:space="preserve"> </w:t>
@@ -10624,13 +10474,7 @@
         <w:pStyle w:val="BodyText"/>
       </w:pPr>
       <w:r>
-        <w:t xml:space="preserve">A related rule constrains the whole study and is stated here once. Generated output is never raked. Raking</w:t>
-      </w:r>
-      <w:r>
-        <w:t xml:space="preserve"> </w:t>
-      </w:r>
-      <w:r>
-        <w:t xml:space="preserve">our own output onto the target marginals would close the marginal gap by construction, because raking</w:t>
+        <w:t xml:space="preserve">A related rule constrains the whole study and is stated here once. Generated output is never raked. Raking this study’s own output onto the target marginals would close the marginal gap by construction, because raking</w:t>
       </w:r>
       <w:r>
         <w:t xml:space="preserve"> </w:t>
@@ -10878,19 +10722,7 @@
         <w:t xml:space="preserve"> </w:t>
       </w:r>
       <w:r>
-        <w:t xml:space="preserve">still printed outside it, and the gate is permanently informational. One further caution is carried</w:t>
-      </w:r>
-      <w:r>
-        <w:t xml:space="preserve"> </w:t>
-      </w:r>
-      <w:r>
-        <w:t xml:space="preserve">openly: the paper that is the true source of the per-person band has not been read by the author,</w:t>
-      </w:r>
-      <w:r>
-        <w:t xml:space="preserve"> </w:t>
-      </w:r>
-      <w:r>
-        <w:t xml:space="preserve">and the figure inside it remains unverified at the time of writing.</w:t>
+        <w:t xml:space="preserve">still printed outside it, and the gate is permanently informational.</w:t>
       </w:r>
     </w:p>
     <w:bookmarkEnd w:id="123"/>
@@ -11108,19 +10940,7 @@
         <w:pStyle w:val="BodyText"/>
       </w:pPr>
       <w:r>
-        <w:t xml:space="preserve">The larger of the two observed-stock campaigns ran to completion, across 35,290 cells in three</w:t>
-      </w:r>
-      <w:r>
-        <w:t xml:space="preserve"> </w:t>
-      </w:r>
-      <w:r>
-        <w:t xml:space="preserve">districts, and its gate board was never executed; it is described here as a compute campaign whose</w:t>
-      </w:r>
-      <w:r>
-        <w:t xml:space="preserve"> </w:t>
-      </w:r>
-      <w:r>
-        <w:t xml:space="preserve">board was deliberately not read, and no scored result from it is claimed anywhere. Within that same</w:t>
+        <w:t xml:space="preserve">The larger of the two observed-stock campaigns ran to completion, across 35,290 cells in three districts. Its gate board was scored separately after this paper’s results were fixed, that scoring found the identical-series defect named in §4.4, and no scored result from the campaign is claimed anywhere in this paper. Within that same</w:t>
       </w:r>
       <w:r>
         <w:t xml:space="preserve"> </w:t>
@@ -11181,7 +11001,7 @@
         <w:t xml:space="preserve"> </w:t>
       </w:r>
       <w:r>
-        <w:t xml:space="preserve">training, and it missed the bar in all nine of its cells by factors of two to six, with five further</w:t>
+        <w:t xml:space="preserve">training, and it missed the bar in all nine of its cells by factors of 1.1 to 3.9, with five further</w:t>
       </w:r>
       <w:r>
         <w:t xml:space="preserve"> </w:t>
@@ -11345,7 +11165,7 @@
         <w:t xml:space="preserve"> </w:t>
       </w:r>
       <w:r>
-        <w:t xml:space="preserve">the target country’s published tables. It won here by a factor of two to six, it runs in seconds, and</w:t>
+        <w:t xml:space="preserve">the target country’s published tables. It won here by a factor of 1.1 to 3.9, it runs in seconds, and</w:t>
       </w:r>
       <w:r>
         <w:t xml:space="preserve"> </w:t>
@@ -11367,60 +11187,6 @@
     <w:p>
       <w:pPr>
         <w:pStyle w:val="FirstParagraph"/>
-      </w:pPr>
-      <w:r>
-        <w:rPr>
-          <w:i/>
-          <w:iCs/>
-        </w:rPr>
-        <w:t xml:space="preserve">Reference list assembled from this project’s own verified citation records. Every DOI below was resolved</w:t>
-      </w:r>
-      <w:r>
-        <w:rPr>
-          <w:i/>
-          <w:iCs/>
-        </w:rPr>
-        <w:t xml:space="preserve"> </w:t>
-      </w:r>
-      <w:r>
-        <w:rPr>
-          <w:i/>
-          <w:iCs/>
-        </w:rPr>
-        <w:t xml:space="preserve">against CrossRef during the pipeline’s citation checks; four such checks are reported in this paper as not</w:t>
-      </w:r>
-      <w:r>
-        <w:rPr>
-          <w:i/>
-          <w:iCs/>
-        </w:rPr>
-        <w:t xml:space="preserve"> </w:t>
-      </w:r>
-      <w:r>
-        <w:rPr>
-          <w:i/>
-          <w:iCs/>
-        </w:rPr>
-        <w:t xml:space="preserve">performed offline and resolve online. One entry is flagged: the review that is the true source of the</w:t>
-      </w:r>
-      <w:r>
-        <w:rPr>
-          <w:i/>
-          <w:iCs/>
-        </w:rPr>
-        <w:t xml:space="preserve"> </w:t>
-      </w:r>
-      <w:r>
-        <w:rPr>
-          <w:i/>
-          <w:iCs/>
-        </w:rPr>
-        <w:t xml:space="preserve">domestic hot water band has not been read by the author, and §7.7 says so in the text.</w:t>
-      </w:r>
-    </w:p>
-    <w:p>
-      <w:pPr>
-        <w:pStyle w:val="BodyText"/>
       </w:pPr>
       <w:r>
         <w:t xml:space="preserve">Beckman, R. J., Baggerly, K. A., and McKay, M. D. (1996). Creating synthetic baseline populations.</w:t>
@@ -11444,6 +11210,39 @@
         <w:pStyle w:val="BodyText"/>
       </w:pPr>
       <w:r>
+        <w:t xml:space="preserve">Crawley, D. B., Lawrie, L. K., Winkelmann, F. C., Buhl, W. F., Huang, Y. J., Pedersen, C. O., Strand, R. K.,</w:t>
+      </w:r>
+      <w:r>
+        <w:t xml:space="preserve"> </w:t>
+      </w:r>
+      <w:r>
+        <w:t xml:space="preserve">Liesen, R. J., Fisher, D. E., Witte, M. J., and Glazer, J. (2001). EnergyPlus: creating a new-generation</w:t>
+      </w:r>
+      <w:r>
+        <w:t xml:space="preserve"> </w:t>
+      </w:r>
+      <w:r>
+        <w:t xml:space="preserve">building energy simulation program.</w:t>
+      </w:r>
+      <w:r>
+        <w:t xml:space="preserve"> </w:t>
+      </w:r>
+      <w:r>
+        <w:rPr>
+          <w:i/>
+          <w:iCs/>
+        </w:rPr>
+        <w:t xml:space="preserve">Energy and Buildings</w:t>
+      </w:r>
+      <w:r>
+        <w:t xml:space="preserve">, 33(4), 319-331. DOI: 10.1016/s0378-7788(00)00114-6</w:t>
+      </w:r>
+    </w:p>
+    <w:p>
+      <w:pPr>
+        <w:pStyle w:val="BodyText"/>
+      </w:pPr>
+      <w:r>
         <w:t xml:space="preserve">Deville, J.-C., and Särndal, C.-E. (1992). Calibration estimators in survey sampling.</w:t>
       </w:r>
       <w:r>
@@ -11479,6 +11278,60 @@
         <w:pStyle w:val="BodyText"/>
       </w:pPr>
       <w:r>
+        <w:t xml:space="preserve">Eurostat. (2009).</w:t>
+      </w:r>
+      <w:r>
+        <w:t xml:space="preserve"> </w:t>
+      </w:r>
+      <w:r>
+        <w:rPr>
+          <w:i/>
+          <w:iCs/>
+        </w:rPr>
+        <w:t xml:space="preserve">Harmonised European Time Use Surveys: 2008 Guidelines</w:t>
+      </w:r>
+      <w:r>
+        <w:t xml:space="preserve">. Methodologies and Working</w:t>
+      </w:r>
+      <w:r>
+        <w:t xml:space="preserve"> </w:t>
+      </w:r>
+      <w:r>
+        <w:t xml:space="preserve">Papers, Catalogue number: KS-RA-08-014-EN. Luxembourg: Publications Office of the European Union.</w:t>
+      </w:r>
+    </w:p>
+    <w:p>
+      <w:pPr>
+        <w:pStyle w:val="BodyText"/>
+      </w:pPr>
+      <w:r>
+        <w:t xml:space="preserve">Eurostat. (2019).</w:t>
+      </w:r>
+      <w:r>
+        <w:t xml:space="preserve"> </w:t>
+      </w:r>
+      <w:r>
+        <w:rPr>
+          <w:i/>
+          <w:iCs/>
+        </w:rPr>
+        <w:t xml:space="preserve">Harmonised European Time Use Surveys (HETUS) 2018 Guidelines</w:t>
+      </w:r>
+      <w:r>
+        <w:t xml:space="preserve">. Manuals and Guidelines,</w:t>
+      </w:r>
+      <w:r>
+        <w:t xml:space="preserve"> </w:t>
+      </w:r>
+      <w:r>
+        <w:t xml:space="preserve">Catalogue number: KS-GQ-19-003-EN. Luxembourg: Publications Office of the European Union.</w:t>
+      </w:r>
+    </w:p>
+    <w:p>
+      <w:pPr>
+        <w:pStyle w:val="BodyText"/>
+      </w:pPr>
+      <w:r>
         <w:t xml:space="preserve">Fuentes, E., Arce, L., and Salom, J. (2018). A review of domestic hot water consumption profiles for</w:t>
       </w:r>
       <w:r>
@@ -11512,7 +11365,143 @@
         <w:t xml:space="preserve">Reviews</w:t>
       </w:r>
       <w:r>
-        <w:t xml:space="preserve">, 81, 1530-1547. DOI: 10.1016/j.rser.2017.05.229 [not read by the author; see §7.7]</w:t>
+        <w:t xml:space="preserve">, 81, 1530-1547. DOI: 10.1016/j.rser.2017.05.229</w:t>
+      </w:r>
+    </w:p>
+    <w:p>
+      <w:pPr>
+        <w:pStyle w:val="BodyText"/>
+      </w:pPr>
+      <w:r>
+        <w:t xml:space="preserve">Hu, E. J., Shen, Y., Wallis, P., Allen-Zhu, Z., Li, Y., Wang, S., Wang, L., and Chen, W. (2022). LoRA:</w:t>
+      </w:r>
+      <w:r>
+        <w:t xml:space="preserve"> </w:t>
+      </w:r>
+      <w:r>
+        <w:t xml:space="preserve">Low-Rank Adaptation of Large Language Models. In</w:t>
+      </w:r>
+      <w:r>
+        <w:t xml:space="preserve"> </w:t>
+      </w:r>
+      <w:r>
+        <w:rPr>
+          <w:i/>
+          <w:iCs/>
+        </w:rPr>
+        <w:t xml:space="preserve">International Conference on Learning Representations</w:t>
+      </w:r>
+      <w:r>
+        <w:rPr>
+          <w:i/>
+          <w:iCs/>
+        </w:rPr>
+        <w:t xml:space="preserve"> </w:t>
+      </w:r>
+      <w:r>
+        <w:rPr>
+          <w:i/>
+          <w:iCs/>
+        </w:rPr>
+        <w:t xml:space="preserve">(ICLR 2022)</w:t>
+      </w:r>
+      <w:r>
+        <w:t xml:space="preserve">. Pre-print DOI: 10.48550/arXiv.2106.09685</w:t>
+      </w:r>
+    </w:p>
+    <w:p>
+      <w:pPr>
+        <w:pStyle w:val="BodyText"/>
+      </w:pPr>
+      <w:r>
+        <w:t xml:space="preserve">Instituto Nacional de Estadistica (INE). (2011).</w:t>
+      </w:r>
+      <w:r>
+        <w:t xml:space="preserve"> </w:t>
+      </w:r>
+      <w:r>
+        <w:rPr>
+          <w:i/>
+          <w:iCs/>
+        </w:rPr>
+        <w:t xml:space="preserve">Encuesta de Empleo del Tiempo 2009-2010: Metodologia</w:t>
+      </w:r>
+      <w:r>
+        <w:t xml:space="preserve">.</w:t>
+      </w:r>
+      <w:r>
+        <w:t xml:space="preserve"> </w:t>
+      </w:r>
+      <w:r>
+        <w:t xml:space="preserve">Madrid: INE.</w:t>
+      </w:r>
+    </w:p>
+    <w:p>
+      <w:pPr>
+        <w:pStyle w:val="BodyText"/>
+      </w:pPr>
+      <w:r>
+        <w:t xml:space="preserve">Iseri, O. K., Gursel Dino, I., and Kalkan, B. (2026). Occupancy modeling using population statistics and</w:t>
+      </w:r>
+      <w:r>
+        <w:t xml:space="preserve"> </w:t>
+      </w:r>
+      <w:r>
+        <w:t xml:space="preserve">machine learning for urban residential built environment.</w:t>
+      </w:r>
+      <w:r>
+        <w:t xml:space="preserve"> </w:t>
+      </w:r>
+      <w:r>
+        <w:rPr>
+          <w:i/>
+          <w:iCs/>
+        </w:rPr>
+        <w:t xml:space="preserve">Energy and Buildings</w:t>
+      </w:r>
+      <w:r>
+        <w:t xml:space="preserve">, 357, 117155. DOI:</w:t>
+      </w:r>
+      <w:r>
+        <w:t xml:space="preserve"> </w:t>
+      </w:r>
+      <w:r>
+        <w:t xml:space="preserve">10.1016/j.enbuild.2026.117155</w:t>
+      </w:r>
+    </w:p>
+    <w:p>
+      <w:pPr>
+        <w:pStyle w:val="BodyText"/>
+      </w:pPr>
+      <w:r>
+        <w:t xml:space="preserve">Istituto Nazionale di Statistica (ISTAT). (2016).</w:t>
+      </w:r>
+      <w:r>
+        <w:t xml:space="preserve"> </w:t>
+      </w:r>
+      <w:r>
+        <w:rPr>
+          <w:i/>
+          <w:iCs/>
+        </w:rPr>
+        <w:t xml:space="preserve">I tempi della vita quotidiana: L’uso del tempo in Italia</w:t>
+      </w:r>
+      <w:r>
+        <w:rPr>
+          <w:i/>
+          <w:iCs/>
+        </w:rPr>
+        <w:t xml:space="preserve"> </w:t>
+      </w:r>
+      <w:r>
+        <w:rPr>
+          <w:i/>
+          <w:iCs/>
+        </w:rPr>
+        <w:t xml:space="preserve">- Anno 2013-2014: Metodologia e primi risultati</w:t>
+      </w:r>
+      <w:r>
+        <w:t xml:space="preserve">. Roma: ISTAT.</w:t>
       </w:r>
     </w:p>
     <w:p>
@@ -11534,7 +11523,81 @@
         <w:pStyle w:val="BodyText"/>
       </w:pPr>
       <w:r>
-        <w:t xml:space="preserve">Lombardi, F., Balderrama, S., Quoilin, S., and Colombo, E. (2020). Generating high-resolution multi-energy</w:t>
+        <w:t xml:space="preserve">Loga, T., Diefenbach, N., and Stein, B. (2012).</w:t>
+      </w:r>
+      <w:r>
+        <w:t xml:space="preserve"> </w:t>
+      </w:r>
+      <w:r>
+        <w:rPr>
+          <w:i/>
+          <w:iCs/>
+        </w:rPr>
+        <w:t xml:space="preserve">Use of Building Typologies for Modelling the Energy</w:t>
+      </w:r>
+      <w:r>
+        <w:rPr>
+          <w:i/>
+          <w:iCs/>
+        </w:rPr>
+        <w:t xml:space="preserve"> </w:t>
+      </w:r>
+      <w:r>
+        <w:rPr>
+          <w:i/>
+          <w:iCs/>
+        </w:rPr>
+        <w:t xml:space="preserve">Balance of the National Residential Building Stocks</w:t>
+      </w:r>
+      <w:r>
+        <w:t xml:space="preserve">. TABULA Synthesis Report. Darmstadt: Institut Wohnen</w:t>
+      </w:r>
+      <w:r>
+        <w:t xml:space="preserve"> </w:t>
+      </w:r>
+      <w:r>
+        <w:t xml:space="preserve">und Umwelt (IWU).</w:t>
+      </w:r>
+    </w:p>
+    <w:p>
+      <w:pPr>
+        <w:pStyle w:val="BodyText"/>
+      </w:pPr>
+      <w:r>
+        <w:t xml:space="preserve">Loga, T., Stein, B., and Diefenbach, N. (2016). TABULA building typologies in 20 European countries -</w:t>
+      </w:r>
+      <w:r>
+        <w:t xml:space="preserve"> </w:t>
+      </w:r>
+      <w:r>
+        <w:t xml:space="preserve">Making energy-related features of residential building stocks comparable.</w:t>
+      </w:r>
+      <w:r>
+        <w:t xml:space="preserve"> </w:t>
+      </w:r>
+      <w:r>
+        <w:rPr>
+          <w:i/>
+          <w:iCs/>
+        </w:rPr>
+        <w:t xml:space="preserve">Energy and Buildings</w:t>
+      </w:r>
+      <w:r>
+        <w:t xml:space="preserve">, 132,</w:t>
+      </w:r>
+      <w:r>
+        <w:t xml:space="preserve"> </w:t>
+      </w:r>
+      <w:r>
+        <w:t xml:space="preserve">4-12. DOI: 10.1016/j.enbuild.2016.06.094</w:t>
+      </w:r>
+    </w:p>
+    <w:p>
+      <w:pPr>
+        <w:pStyle w:val="BodyText"/>
+      </w:pPr>
+      <w:r>
+        <w:t xml:space="preserve">Lombardi, F., Balderrama, S., Quoilin, S., and Colombo, E. (2019). Generating high-resolution multi-energy</w:t>
       </w:r>
       <w:r>
         <w:t xml:space="preserve"> </w:t>
@@ -11553,7 +11616,13 @@
         <w:t xml:space="preserve">Energy</w:t>
       </w:r>
       <w:r>
-        <w:t xml:space="preserve">.</w:t>
+        <w:t xml:space="preserve">, 177, 433-444. DOI:</w:t>
+      </w:r>
+      <w:r>
+        <w:t xml:space="preserve"> </w:t>
+      </w:r>
+      <w:r>
+        <w:t xml:space="preserve">10.1016/j.energy.2019.04.097</w:t>
       </w:r>
     </w:p>
     <w:p>
@@ -11621,7 +11690,7 @@
         <w:t xml:space="preserve">Building and Environment</w:t>
       </w:r>
       <w:r>
-        <w:t xml:space="preserve">. DOI: 10.1016/j.buildenv.2021.107785</w:t>
+        <w:t xml:space="preserve">, 196, 107785. DOI: 10.1016/j.buildenv.2021.107785</w:t>
       </w:r>
     </w:p>
     <w:p>
@@ -11669,7 +11738,7 @@
         <w:t xml:space="preserve">Energy and Buildings</w:t>
       </w:r>
       <w:r>
-        <w:t xml:space="preserve">, 40(8), 1560-1566.</w:t>
+        <w:t xml:space="preserve">, 40(8), 1560-1566. DOI: 10.1016/j.enbuild.2008.02.006</w:t>
       </w:r>
     </w:p>
     <w:p>
@@ -11710,13 +11779,67 @@
         <w:pStyle w:val="BodyText"/>
       </w:pPr>
       <w:r>
-        <w:t xml:space="preserve">Vosoughkhosravi, S., Dixon-Grasso, L., and Jafari, A. (2023). The impact of occupancy on building energy</w:t>
-      </w:r>
-      <w:r>
-        <w:t xml:space="preserve"> </w:t>
-      </w:r>
-      <w:r>
-        <w:t xml:space="preserve">performance: a review.</w:t>
+        <w:t xml:space="preserve">Shokri, R., Stronati, M., Song, C., and Shmatikov, V. (2017). Membership Inference Attacks Against Machine</w:t>
+      </w:r>
+      <w:r>
+        <w:t xml:space="preserve"> </w:t>
+      </w:r>
+      <w:r>
+        <w:t xml:space="preserve">Learning Models. In</w:t>
+      </w:r>
+      <w:r>
+        <w:t xml:space="preserve"> </w:t>
+      </w:r>
+      <w:r>
+        <w:rPr>
+          <w:i/>
+          <w:iCs/>
+        </w:rPr>
+        <w:t xml:space="preserve">2017 IEEE Symposium on Security and Privacy (SP)</w:t>
+      </w:r>
+      <w:r>
+        <w:t xml:space="preserve">, pp. 3-18. DOI: 10.1109/sp.2017.41</w:t>
+      </w:r>
+    </w:p>
+    <w:p>
+      <w:pPr>
+        <w:pStyle w:val="BodyText"/>
+      </w:pPr>
+      <w:r>
+        <w:t xml:space="preserve">Sullivan, O., and Gershuny, J. (2023).</w:t>
+      </w:r>
+      <w:r>
+        <w:t xml:space="preserve"> </w:t>
+      </w:r>
+      <w:r>
+        <w:rPr>
+          <w:i/>
+          <w:iCs/>
+        </w:rPr>
+        <w:t xml:space="preserve">United Kingdom Time Use Survey, 2014-2015</w:t>
+      </w:r>
+      <w:r>
+        <w:t xml:space="preserve">. [data collection]. 1st</w:t>
+      </w:r>
+      <w:r>
+        <w:t xml:space="preserve"> </w:t>
+      </w:r>
+      <w:r>
+        <w:t xml:space="preserve">Edition. UK Data Service. SN: 8128. DOI: 10.5255/UKDA-SN-8128-1</w:t>
+      </w:r>
+    </w:p>
+    <w:p>
+      <w:pPr>
+        <w:pStyle w:val="BodyText"/>
+      </w:pPr>
+      <w:r>
+        <w:t xml:space="preserve">Vosoughkhosravi, S., Jafari, A., and Zhu, Y. (2023). Application of American time use survey (ATUS) in</w:t>
+      </w:r>
+      <w:r>
+        <w:t xml:space="preserve"> </w:t>
+      </w:r>
+      <w:r>
+        <w:t xml:space="preserve">modelling energy-related occupant-building interactions: a comprehensive review.</w:t>
       </w:r>
       <w:r>
         <w:t xml:space="preserve"> </w:t>
@@ -11729,7 +11852,13 @@
         <w:t xml:space="preserve">Energy and Buildings</w:t>
       </w:r>
       <w:r>
-        <w:t xml:space="preserve">. DOI: 10.1016/j.enbuild.2023.113245</w:t>
+        <w:t xml:space="preserve">,</w:t>
+      </w:r>
+      <w:r>
+        <w:t xml:space="preserve"> </w:t>
+      </w:r>
+      <w:r>
+        <w:t xml:space="preserve">294, 113245. DOI: 10.1016/j.enbuild.2023.113245</w:t>
       </w:r>
     </w:p>
     <w:p>
@@ -11756,55 +11885,7 @@
         <w:t xml:space="preserve">Applied Energy</w:t>
       </w:r>
       <w:r>
-        <w:t xml:space="preserve">, 87(6), 1880-1892.</w:t>
-      </w:r>
-    </w:p>
-    <w:p>
-      <w:pPr>
-        <w:pStyle w:val="BodyText"/>
-      </w:pPr>
-      <w:r>
-        <w:t xml:space="preserve">⚠</w:t>
-      </w:r>
-      <w:r>
-        <w:t xml:space="preserve"> </w:t>
-      </w:r>
-      <w:r>
-        <w:rPr>
-          <w:b/>
-          <w:bCs/>
-        </w:rPr>
-        <w:t xml:space="preserve">To be completed before submission.</w:t>
-      </w:r>
-      <w:r>
-        <w:t xml:space="preserve"> </w:t>
-      </w:r>
-      <w:r>
-        <w:t xml:space="preserve">The TABULA typology documentation, the three national survey</w:t>
-      </w:r>
-      <w:r>
-        <w:t xml:space="preserve"> </w:t>
-      </w:r>
-      <w:r>
-        <w:t xml:space="preserve">user guides, the Eurostat HETUS methodological guidelines, and the author’s own prior line are cited in the</w:t>
-      </w:r>
-      <w:r>
-        <w:t xml:space="preserve"> </w:t>
-      </w:r>
-      <w:r>
-        <w:t xml:space="preserve">text and are not yet formatted here. The HETUS guidelines in particular carry an open check recorded in</w:t>
-      </w:r>
-      <w:r>
-        <w:t xml:space="preserve"> </w:t>
-      </w:r>
-      <w:r>
-        <w:t xml:space="preserve">§2.1: they have not been read directly on the question of diary-day allocation, and no claim about the</w:t>
-      </w:r>
-      <w:r>
-        <w:t xml:space="preserve"> </w:t>
-      </w:r>
-      <w:r>
-        <w:t xml:space="preserve">HETUS framework’s requirements is made in this paper until they are.</w:t>
+        <w:t xml:space="preserve">, 87(6), 1880-1892. DOI: 10.1016/j.apenergy.2009.11.006</w:t>
       </w:r>
     </w:p>
     <w:bookmarkEnd w:id="129"/>

</xml_diff>